<commit_message>
feat: Support Markdown (.md) file upload for template guidelines and document attachments
</commit_message>
<xml_diff>
--- a/prom surat.docx
+++ b/prom surat.docx
@@ -2,15 +2,6 @@
 <file path=word/document.xml><?xml version="1.0" encoding="utf-8"?>
 <w:document xmlns:wpc="http://schemas.microsoft.com/office/word/2010/wordprocessingCanvas" xmlns:cx="http://schemas.microsoft.com/office/drawing/2014/chartex" xmlns:cx1="http://schemas.microsoft.com/office/drawing/2015/9/8/chartex" xmlns:cx2="http://schemas.microsoft.com/office/drawing/2015/10/21/chartex" xmlns:cx3="http://schemas.microsoft.com/office/drawing/2016/5/9/chartex" xmlns:cx4="http://schemas.microsoft.com/office/drawing/2016/5/10/chartex" xmlns:cx5="http://schemas.microsoft.com/office/drawing/2016/5/11/chartex" xmlns:cx6="http://schemas.microsoft.com/office/drawing/2016/5/12/chartex" xmlns:cx7="http://schemas.microsoft.com/office/drawing/2016/5/13/chartex" xmlns:cx8="http://schemas.microsoft.com/office/drawing/2016/5/14/chartex" xmlns:mc="http://schemas.openxmlformats.org/markup-compatibility/2006" xmlns:aink="http://schemas.microsoft.com/office/drawing/2016/ink" xmlns:am3d="http://schemas.microsoft.com/office/drawing/2017/model3d" xmlns:o="urn:schemas-microsoft-com:office:office" xmlns:oel="http://schemas.microsoft.com/office/2019/extlst" xmlns:r="http://schemas.openxmlformats.org/officeDocument/2006/relationships" xmlns:m="http://schemas.openxmlformats.org/officeDocument/2006/math" xmlns:v="urn:schemas-microsoft-com:vml" xmlns:wp14="http://schemas.microsoft.com/office/word/2010/wordprocessingDrawing" xmlns:wp="http://schemas.openxmlformats.org/drawingml/2006/wordprocessingDrawing" xmlns:w10="urn:schemas-microsoft-com:office:word" xmlns:w="http://schemas.openxmlformats.org/wordprocessingml/2006/main" xmlns:w14="http://schemas.microsoft.com/office/word/2010/wordml" xmlns:w15="http://schemas.microsoft.com/office/word/2012/wordml" xmlns:w16cex="http://schemas.microsoft.com/office/word/2018/wordml/cex" xmlns:w16cid="http://schemas.microsoft.com/office/word/2016/wordml/cid" xmlns:w16="http://schemas.microsoft.com/office/word/2018/wordml" xmlns:w16du="http://schemas.microsoft.com/office/word/2023/wordml/word16du" xmlns:w16sdtdh="http://schemas.microsoft.com/office/word/2020/wordml/sdtdatahash" xmlns:w16sdtfl="http://schemas.microsoft.com/office/word/2024/wordml/sdtformatlock" xmlns:w16se="http://schemas.microsoft.com/office/word/2015/wordml/symex" xmlns:wpg="http://schemas.microsoft.com/office/word/2010/wordprocessingGroup" xmlns:wpi="http://schemas.microsoft.com/office/word/2010/wordprocessingInk" xmlns:wne="http://schemas.microsoft.com/office/word/2006/wordml" xmlns:wps="http://schemas.microsoft.com/office/word/2010/wordprocessingShape" mc:Ignorable="w14 w15 w16se w16cid w16 w16cex w16sdtdh w16sdtfl w16du wp14">
   <w:body>
-    <w:p>
-      <w:pPr>
-        <w:rPr>
-          <w:rFonts w:ascii="Times New Roman" w:hAnsi="Times New Roman" w:cs="Times New Roman"/>
-          <w:sz w:val="24"/>
-          <w:szCs w:val="24"/>
-        </w:rPr>
-      </w:pPr>
-    </w:p>
     <w:p>
       <w:pPr>
         <w:rPr>
@@ -477,16 +468,7 @@
           <w:szCs w:val="24"/>
           <w:lang w:val="nb-NO"/>
         </w:rPr>
-        <w:t xml:space="preserve">Bot otomatis menggenerate </w:t>
-      </w:r>
-      <w:r>
-        <w:rPr>
-          <w:rFonts w:ascii="Times New Roman" w:hAnsi="Times New Roman" w:cs="Times New Roman"/>
-          <w:sz w:val="24"/>
-          <w:szCs w:val="24"/>
-          <w:lang w:val="nb-NO"/>
-        </w:rPr>
-        <w:t>2 folder "word" dan "pdf"</w:t>
+        <w:t>Bot otomatis menggenerate 2 folder "word" dan "pdf"</w:t>
       </w:r>
     </w:p>
     <w:p>
@@ -876,138 +858,59 @@
     </w:p>
     <w:p>
       <w:pPr>
-        <w:pStyle w:val="ListParagraph"/>
-        <w:numPr>
-          <w:ilvl w:val="0"/>
-          <w:numId w:val="4"/>
-        </w:numPr>
-        <w:rPr>
-          <w:rFonts w:ascii="Times New Roman" w:hAnsi="Times New Roman" w:cs="Times New Roman"/>
-          <w:sz w:val="24"/>
-          <w:szCs w:val="24"/>
-          <w:lang w:val="sv-SE"/>
-        </w:rPr>
-      </w:pPr>
-      <w:r>
-        <w:rPr>
-          <w:rFonts w:ascii="Times New Roman" w:hAnsi="Times New Roman" w:cs="Times New Roman"/>
-          <w:sz w:val="24"/>
-          <w:szCs w:val="24"/>
-          <w:lang w:val="sv-SE"/>
-        </w:rPr>
-        <w:t>Web menampilkan daftar file word yang sudah dit</w:t>
-      </w:r>
-      <w:r>
-        <w:rPr>
-          <w:rFonts w:ascii="Times New Roman" w:hAnsi="Times New Roman" w:cs="Times New Roman"/>
-          <w:sz w:val="24"/>
-          <w:szCs w:val="24"/>
-          <w:lang w:val="sv-SE"/>
-        </w:rPr>
-        <w:t xml:space="preserve">erima (dan tombol edit dimasing masing daftar), ketika user menekan tombol edit, maka </w:t>
-      </w:r>
-    </w:p>
-    <w:p>
-      <w:pPr>
-        <w:pStyle w:val="ListParagraph"/>
-        <w:numPr>
-          <w:ilvl w:val="0"/>
-          <w:numId w:val="4"/>
-        </w:numPr>
-        <w:rPr>
-          <w:rFonts w:ascii="Times New Roman" w:hAnsi="Times New Roman" w:cs="Times New Roman"/>
-          <w:sz w:val="24"/>
-          <w:szCs w:val="24"/>
-          <w:lang w:val="sv-SE"/>
-        </w:rPr>
-      </w:pPr>
-      <w:r>
-        <w:rPr>
-          <w:rFonts w:ascii="Times New Roman" w:hAnsi="Times New Roman" w:cs="Times New Roman"/>
-          <w:sz w:val="24"/>
-          <w:szCs w:val="24"/>
-          <w:lang w:val="sv-SE"/>
-        </w:rPr>
-        <w:t xml:space="preserve">Web menampilkan Preview </w:t>
-      </w:r>
-      <w:r>
-        <w:rPr>
-          <w:rFonts w:ascii="Times New Roman" w:hAnsi="Times New Roman" w:cs="Times New Roman"/>
-          <w:sz w:val="24"/>
-          <w:szCs w:val="24"/>
-          <w:lang w:val="sv-SE"/>
-        </w:rPr>
-        <w:t>yang menampilkan</w:t>
-      </w:r>
-      <w:r>
-        <w:rPr>
-          <w:rFonts w:ascii="Times New Roman" w:hAnsi="Times New Roman" w:cs="Times New Roman"/>
-          <w:sz w:val="24"/>
-          <w:szCs w:val="24"/>
-          <w:lang w:val="sv-SE"/>
-        </w:rPr>
-        <w:t xml:space="preserve"> Cover</w:t>
-      </w:r>
-      <w:r>
-        <w:rPr>
-          <w:rFonts w:ascii="Times New Roman" w:hAnsi="Times New Roman" w:cs="Times New Roman"/>
-          <w:sz w:val="24"/>
-          <w:szCs w:val="24"/>
-          <w:lang w:val="sv-SE"/>
-        </w:rPr>
-        <w:t xml:space="preserve">, </w:t>
-      </w:r>
-      <w:r>
-        <w:rPr>
-          <w:rFonts w:ascii="Times New Roman" w:hAnsi="Times New Roman" w:cs="Times New Roman"/>
-          <w:sz w:val="24"/>
-          <w:szCs w:val="24"/>
-          <w:lang w:val="sv-SE"/>
-        </w:rPr>
-        <w:t>Kop header dokumen</w:t>
-      </w:r>
-      <w:r>
-        <w:rPr>
-          <w:rFonts w:ascii="Times New Roman" w:hAnsi="Times New Roman" w:cs="Times New Roman"/>
-          <w:sz w:val="24"/>
-          <w:szCs w:val="24"/>
-          <w:lang w:val="sv-SE"/>
-        </w:rPr>
-        <w:t>, dan tabel Reveision index</w:t>
-      </w:r>
-      <w:r>
-        <w:rPr>
-          <w:rFonts w:ascii="Times New Roman" w:hAnsi="Times New Roman" w:cs="Times New Roman"/>
-          <w:sz w:val="24"/>
-          <w:szCs w:val="24"/>
+        <w:rPr>
+          <w:rFonts w:ascii="Times New Roman" w:hAnsi="Times New Roman" w:cs="Times New Roman"/>
+          <w:sz w:val="24"/>
+          <w:szCs w:val="24"/>
+          <w:lang w:val="sv-SE"/>
+        </w:rPr>
+      </w:pPr>
+      <w:r>
+        <w:rPr>
+          <w:rFonts w:ascii="Times New Roman" w:hAnsi="Times New Roman" w:cs="Times New Roman"/>
+          <w:sz w:val="24"/>
+          <w:szCs w:val="24"/>
+          <w:lang w:val="sv-SE"/>
+        </w:rPr>
+        <w:lastRenderedPageBreak/>
+        <w:t>Buat tab baru di ”</w:t>
+      </w:r>
+      <w:r>
+        <w:rPr>
           <w:lang w:val="sv-SE"/>
         </w:rPr>
         <w:t xml:space="preserve"> </w:t>
       </w:r>
-    </w:p>
-    <w:p>
-      <w:pPr>
-        <w:pStyle w:val="ListParagraph"/>
-        <w:rPr>
-          <w:rFonts w:ascii="Times New Roman" w:hAnsi="Times New Roman" w:cs="Times New Roman"/>
-          <w:sz w:val="24"/>
-          <w:szCs w:val="24"/>
-          <w:lang w:val="sv-SE"/>
-        </w:rPr>
-      </w:pPr>
-      <w:r>
-        <w:rPr>
-          <w:rFonts w:ascii="Times New Roman" w:hAnsi="Times New Roman" w:cs="Times New Roman"/>
-          <w:sz w:val="24"/>
-          <w:szCs w:val="24"/>
-          <w:lang w:val="sv-SE"/>
-        </w:rPr>
-        <w:lastRenderedPageBreak/>
+      <w:r>
+        <w:rPr>
+          <w:rFonts w:ascii="Times New Roman" w:hAnsi="Times New Roman" w:cs="Times New Roman"/>
+          <w:sz w:val="24"/>
+          <w:szCs w:val="24"/>
+          <w:lang w:val="sv-SE"/>
+        </w:rPr>
+        <w:t>Kelola Master Kategori &amp; Kode Surat</w:t>
+      </w:r>
+      <w:r>
+        <w:rPr>
+          <w:rFonts w:ascii="Times New Roman" w:hAnsi="Times New Roman" w:cs="Times New Roman"/>
+          <w:sz w:val="24"/>
+          <w:szCs w:val="24"/>
+          <w:lang w:val="sv-SE"/>
+        </w:rPr>
+        <w:t xml:space="preserve">”, </w:t>
+      </w:r>
+      <w:r>
+        <w:rPr>
+          <w:rFonts w:ascii="Times New Roman" w:hAnsi="Times New Roman" w:cs="Times New Roman"/>
+          <w:sz w:val="24"/>
+          <w:szCs w:val="24"/>
+          <w:lang w:val="sv-SE"/>
+        </w:rPr>
         <w:drawing>
-          <wp:inline distT="0" distB="0" distL="0" distR="0" wp14:anchorId="26B2956C" wp14:editId="4D36D061">
-            <wp:extent cx="3002280" cy="2119238"/>
-            <wp:effectExtent l="0" t="0" r="7620" b="0"/>
-            <wp:docPr id="1508502901" name="Picture 1"/>
+          <wp:inline distT="0" distB="0" distL="0" distR="0" wp14:anchorId="0130BD2F" wp14:editId="30F3AC44">
+            <wp:extent cx="5943600" cy="3749040"/>
+            <wp:effectExtent l="0" t="0" r="0" b="3810"/>
+            <wp:docPr id="1370954542" name="Picture 1"/>
             <wp:cNvGraphicFramePr>
               <a:graphicFrameLocks xmlns:a="http://schemas.openxmlformats.org/drawingml/2006/main" noChangeAspect="1"/>
             </wp:cNvGraphicFramePr>
@@ -1015,11 +918,612 @@
               <a:graphicData uri="http://schemas.openxmlformats.org/drawingml/2006/picture">
                 <pic:pic xmlns:pic="http://schemas.openxmlformats.org/drawingml/2006/picture">
                   <pic:nvPicPr>
-                    <pic:cNvPr id="1508502901" name=""/>
+                    <pic:cNvPr id="1370954542" name=""/>
+                    <pic:cNvPicPr/>
+                  </pic:nvPicPr>
+                  <pic:blipFill rotWithShape="1">
+                    <a:blip r:embed="rId5"/>
+                    <a:srcRect b="15693"/>
+                    <a:stretch>
+                      <a:fillRect/>
+                    </a:stretch>
+                  </pic:blipFill>
+                  <pic:spPr bwMode="auto">
+                    <a:xfrm>
+                      <a:off x="0" y="0"/>
+                      <a:ext cx="5943600" cy="3749040"/>
+                    </a:xfrm>
+                    <a:prstGeom prst="rect">
+                      <a:avLst/>
+                    </a:prstGeom>
+                    <a:ln>
+                      <a:noFill/>
+                    </a:ln>
+                    <a:extLst>
+                      <a:ext uri="{53640926-AAD7-44D8-BBD7-CCE9431645EC}">
+                        <a14:shadowObscured xmlns:a14="http://schemas.microsoft.com/office/drawing/2010/main"/>
+                      </a:ext>
+                    </a:extLst>
+                  </pic:spPr>
+                </pic:pic>
+              </a:graphicData>
+            </a:graphic>
+          </wp:inline>
+        </w:drawing>
+      </w:r>
+    </w:p>
+    <w:p>
+      <w:pPr>
+        <w:rPr>
+          <w:rFonts w:ascii="Times New Roman" w:hAnsi="Times New Roman" w:cs="Times New Roman"/>
+          <w:sz w:val="24"/>
+          <w:szCs w:val="24"/>
+          <w:lang w:val="sv-SE"/>
+        </w:rPr>
+      </w:pPr>
+      <w:r>
+        <w:rPr>
+          <w:rFonts w:ascii="Times New Roman" w:hAnsi="Times New Roman" w:cs="Times New Roman"/>
+          <w:sz w:val="24"/>
+          <w:szCs w:val="24"/>
+          <w:lang w:val="sv-SE"/>
+        </w:rPr>
+        <w:t xml:space="preserve">Buat tab </w:t>
+      </w:r>
+      <w:r>
+        <w:rPr>
+          <w:rFonts w:ascii="Times New Roman" w:hAnsi="Times New Roman" w:cs="Times New Roman"/>
+          <w:sz w:val="24"/>
+          <w:szCs w:val="24"/>
+          <w:lang w:val="sv-SE"/>
+        </w:rPr>
+        <w:t xml:space="preserve">”Acuan Template Dokumen” </w:t>
+      </w:r>
+      <w:r>
+        <w:rPr>
+          <w:rFonts w:ascii="Times New Roman" w:hAnsi="Times New Roman" w:cs="Times New Roman"/>
+          <w:sz w:val="24"/>
+          <w:szCs w:val="24"/>
+          <w:lang w:val="sv-SE"/>
+        </w:rPr>
+        <w:t xml:space="preserve">barunya dibawah ini, tab tersebut berisi </w:t>
+      </w:r>
+    </w:p>
+    <w:p>
+      <w:pPr>
+        <w:pStyle w:val="ListParagraph"/>
+        <w:numPr>
+          <w:ilvl w:val="0"/>
+          <w:numId w:val="9"/>
+        </w:numPr>
+        <w:rPr>
+          <w:rFonts w:ascii="Times New Roman" w:hAnsi="Times New Roman" w:cs="Times New Roman"/>
+          <w:sz w:val="24"/>
+          <w:szCs w:val="24"/>
+          <w:lang w:val="sv-SE"/>
+        </w:rPr>
+      </w:pPr>
+      <w:r>
+        <w:rPr>
+          <w:rFonts w:ascii="Times New Roman" w:hAnsi="Times New Roman" w:cs="Times New Roman"/>
+          <w:sz w:val="24"/>
+          <w:szCs w:val="24"/>
+          <w:lang w:val="sv-SE"/>
+        </w:rPr>
+        <w:t>Kolom untuk upload file dalam (txt)</w:t>
+      </w:r>
+    </w:p>
+    <w:p>
+      <w:pPr>
+        <w:pStyle w:val="ListParagraph"/>
+        <w:numPr>
+          <w:ilvl w:val="0"/>
+          <w:numId w:val="9"/>
+        </w:numPr>
+        <w:rPr>
+          <w:rFonts w:ascii="Times New Roman" w:hAnsi="Times New Roman" w:cs="Times New Roman"/>
+          <w:sz w:val="24"/>
+          <w:szCs w:val="24"/>
+        </w:rPr>
+      </w:pPr>
+      <w:r>
+        <w:rPr>
+          <w:rFonts w:ascii="Times New Roman" w:hAnsi="Times New Roman" w:cs="Times New Roman"/>
+          <w:sz w:val="24"/>
+          <w:szCs w:val="24"/>
+        </w:rPr>
+        <w:t>Kolom untuk upload file d</w:t>
+      </w:r>
+      <w:r>
+        <w:rPr>
+          <w:rFonts w:ascii="Times New Roman" w:hAnsi="Times New Roman" w:cs="Times New Roman"/>
+          <w:sz w:val="24"/>
+          <w:szCs w:val="24"/>
+        </w:rPr>
+        <w:t>alam (</w:t>
+      </w:r>
+      <w:r>
+        <w:rPr>
+          <w:rFonts w:ascii="Times New Roman" w:hAnsi="Times New Roman" w:cs="Times New Roman"/>
+          <w:sz w:val="24"/>
+          <w:szCs w:val="24"/>
+        </w:rPr>
+        <w:t>pdf</w:t>
+      </w:r>
+      <w:r>
+        <w:rPr>
+          <w:rFonts w:ascii="Times New Roman" w:hAnsi="Times New Roman" w:cs="Times New Roman"/>
+          <w:sz w:val="24"/>
+          <w:szCs w:val="24"/>
+        </w:rPr>
+        <w:t>)</w:t>
+      </w:r>
+    </w:p>
+    <w:p>
+      <w:pPr>
+        <w:pStyle w:val="ListParagraph"/>
+        <w:numPr>
+          <w:ilvl w:val="0"/>
+          <w:numId w:val="9"/>
+        </w:numPr>
+        <w:rPr>
+          <w:rFonts w:ascii="Times New Roman" w:hAnsi="Times New Roman" w:cs="Times New Roman"/>
+          <w:sz w:val="24"/>
+          <w:szCs w:val="24"/>
+        </w:rPr>
+      </w:pPr>
+      <w:r>
+        <w:rPr>
+          <w:rFonts w:ascii="Times New Roman" w:hAnsi="Times New Roman" w:cs="Times New Roman"/>
+          <w:sz w:val="24"/>
+          <w:szCs w:val="24"/>
+        </w:rPr>
+        <w:t xml:space="preserve">Web/bot </w:t>
+      </w:r>
+      <w:proofErr w:type="spellStart"/>
+      <w:r>
+        <w:rPr>
+          <w:rFonts w:ascii="Times New Roman" w:hAnsi="Times New Roman" w:cs="Times New Roman"/>
+          <w:sz w:val="24"/>
+          <w:szCs w:val="24"/>
+        </w:rPr>
+        <w:t>akan</w:t>
+      </w:r>
+      <w:proofErr w:type="spellEnd"/>
+      <w:r>
+        <w:rPr>
+          <w:rFonts w:ascii="Times New Roman" w:hAnsi="Times New Roman" w:cs="Times New Roman"/>
+          <w:sz w:val="24"/>
+          <w:szCs w:val="24"/>
+        </w:rPr>
+        <w:t xml:space="preserve"> </w:t>
+      </w:r>
+      <w:proofErr w:type="spellStart"/>
+      <w:r>
+        <w:rPr>
+          <w:rFonts w:ascii="Times New Roman" w:hAnsi="Times New Roman" w:cs="Times New Roman"/>
+          <w:sz w:val="24"/>
+          <w:szCs w:val="24"/>
+        </w:rPr>
+        <w:t>menjadikan</w:t>
+      </w:r>
+      <w:proofErr w:type="spellEnd"/>
+      <w:r>
+        <w:rPr>
+          <w:rFonts w:ascii="Times New Roman" w:hAnsi="Times New Roman" w:cs="Times New Roman"/>
+          <w:sz w:val="24"/>
+          <w:szCs w:val="24"/>
+        </w:rPr>
+        <w:t xml:space="preserve"> file </w:t>
+      </w:r>
+      <w:r>
+        <w:rPr>
+          <w:rFonts w:ascii="Times New Roman" w:hAnsi="Times New Roman" w:cs="Times New Roman"/>
+          <w:sz w:val="24"/>
+          <w:szCs w:val="24"/>
+        </w:rPr>
+        <w:t>(txt)</w:t>
+      </w:r>
+      <w:r>
+        <w:rPr>
+          <w:rFonts w:ascii="Times New Roman" w:hAnsi="Times New Roman" w:cs="Times New Roman"/>
+          <w:sz w:val="24"/>
+          <w:szCs w:val="24"/>
+        </w:rPr>
+        <w:t xml:space="preserve"> tersebut sebagai </w:t>
+      </w:r>
+      <w:proofErr w:type="spellStart"/>
+      <w:r>
+        <w:rPr>
+          <w:rFonts w:ascii="Times New Roman" w:hAnsi="Times New Roman" w:cs="Times New Roman"/>
+          <w:sz w:val="24"/>
+          <w:szCs w:val="24"/>
+        </w:rPr>
+        <w:t>acuan</w:t>
+      </w:r>
+      <w:proofErr w:type="spellEnd"/>
+      <w:r>
+        <w:rPr>
+          <w:rFonts w:ascii="Times New Roman" w:hAnsi="Times New Roman" w:cs="Times New Roman"/>
+          <w:sz w:val="24"/>
+          <w:szCs w:val="24"/>
+        </w:rPr>
+        <w:t xml:space="preserve"> </w:t>
+      </w:r>
+      <w:proofErr w:type="spellStart"/>
+      <w:r>
+        <w:rPr>
+          <w:rFonts w:ascii="Times New Roman" w:hAnsi="Times New Roman" w:cs="Times New Roman"/>
+          <w:sz w:val="24"/>
+          <w:szCs w:val="24"/>
+        </w:rPr>
+        <w:t>dasar</w:t>
+      </w:r>
+      <w:proofErr w:type="spellEnd"/>
+      <w:r>
+        <w:rPr>
+          <w:rFonts w:ascii="Times New Roman" w:hAnsi="Times New Roman" w:cs="Times New Roman"/>
+          <w:sz w:val="24"/>
+          <w:szCs w:val="24"/>
+        </w:rPr>
+        <w:t xml:space="preserve"> </w:t>
+      </w:r>
+      <w:proofErr w:type="spellStart"/>
+      <w:r>
+        <w:rPr>
+          <w:rFonts w:ascii="Times New Roman" w:hAnsi="Times New Roman" w:cs="Times New Roman"/>
+          <w:sz w:val="24"/>
+          <w:szCs w:val="24"/>
+        </w:rPr>
+        <w:t>utama</w:t>
+      </w:r>
+      <w:proofErr w:type="spellEnd"/>
+      <w:r>
+        <w:rPr>
+          <w:rFonts w:ascii="Times New Roman" w:hAnsi="Times New Roman" w:cs="Times New Roman"/>
+          <w:sz w:val="24"/>
+          <w:szCs w:val="24"/>
+        </w:rPr>
+        <w:t xml:space="preserve"> untuk </w:t>
+      </w:r>
+      <w:proofErr w:type="spellStart"/>
+      <w:r>
+        <w:rPr>
+          <w:rFonts w:ascii="Times New Roman" w:hAnsi="Times New Roman" w:cs="Times New Roman"/>
+          <w:sz w:val="24"/>
+          <w:szCs w:val="24"/>
+        </w:rPr>
+        <w:t>mengedit</w:t>
+      </w:r>
+      <w:proofErr w:type="spellEnd"/>
+      <w:r>
+        <w:rPr>
+          <w:rFonts w:ascii="Times New Roman" w:hAnsi="Times New Roman" w:cs="Times New Roman"/>
+          <w:sz w:val="24"/>
+          <w:szCs w:val="24"/>
+        </w:rPr>
+        <w:t xml:space="preserve"> </w:t>
+      </w:r>
+      <w:r>
+        <w:rPr>
+          <w:rFonts w:ascii="Times New Roman" w:hAnsi="Times New Roman" w:cs="Times New Roman"/>
+          <w:sz w:val="24"/>
+          <w:szCs w:val="24"/>
+        </w:rPr>
+        <w:t xml:space="preserve">keseluruhan </w:t>
+      </w:r>
+      <w:proofErr w:type="spellStart"/>
+      <w:r>
+        <w:rPr>
+          <w:rFonts w:ascii="Times New Roman" w:hAnsi="Times New Roman" w:cs="Times New Roman"/>
+          <w:sz w:val="24"/>
+          <w:szCs w:val="24"/>
+        </w:rPr>
+        <w:t>isi</w:t>
+      </w:r>
+      <w:proofErr w:type="spellEnd"/>
+      <w:r>
+        <w:rPr>
+          <w:rFonts w:ascii="Times New Roman" w:hAnsi="Times New Roman" w:cs="Times New Roman"/>
+          <w:sz w:val="24"/>
+          <w:szCs w:val="24"/>
+        </w:rPr>
+        <w:t xml:space="preserve"> dan halaman file dalam folder word yang </w:t>
+      </w:r>
+      <w:proofErr w:type="spellStart"/>
+      <w:r>
+        <w:rPr>
+          <w:rFonts w:ascii="Times New Roman" w:hAnsi="Times New Roman" w:cs="Times New Roman"/>
+          <w:sz w:val="24"/>
+          <w:szCs w:val="24"/>
+        </w:rPr>
+        <w:t>sudah</w:t>
+      </w:r>
+      <w:proofErr w:type="spellEnd"/>
+      <w:r>
+        <w:rPr>
+          <w:rFonts w:ascii="Times New Roman" w:hAnsi="Times New Roman" w:cs="Times New Roman"/>
+          <w:sz w:val="24"/>
+          <w:szCs w:val="24"/>
+        </w:rPr>
+        <w:t xml:space="preserve"> di upload sebelumnya</w:t>
+      </w:r>
+      <w:r>
+        <w:rPr>
+          <w:rFonts w:ascii="Times New Roman" w:hAnsi="Times New Roman" w:cs="Times New Roman"/>
+          <w:sz w:val="24"/>
+          <w:szCs w:val="24"/>
+        </w:rPr>
+        <w:t xml:space="preserve"> </w:t>
+      </w:r>
+    </w:p>
+    <w:p>
+      <w:pPr>
+        <w:pStyle w:val="ListParagraph"/>
+        <w:numPr>
+          <w:ilvl w:val="0"/>
+          <w:numId w:val="9"/>
+        </w:numPr>
+        <w:rPr>
+          <w:rFonts w:ascii="Times New Roman" w:hAnsi="Times New Roman" w:cs="Times New Roman"/>
+          <w:sz w:val="24"/>
+          <w:szCs w:val="24"/>
+          <w:lang w:val="sv-SE"/>
+        </w:rPr>
+      </w:pPr>
+      <w:r>
+        <w:rPr>
+          <w:rFonts w:ascii="Times New Roman" w:hAnsi="Times New Roman" w:cs="Times New Roman"/>
+          <w:sz w:val="24"/>
+          <w:szCs w:val="24"/>
+          <w:lang w:val="sv-SE"/>
+        </w:rPr>
+        <w:t>Jadikan file pdf sebagai dasar kedua (bentuknya seperti apa, tataletaknya dimana, dan bagaimana looks nya)</w:t>
+      </w:r>
+      <w:r>
+        <w:rPr>
+          <w:rFonts w:ascii="Times New Roman" w:hAnsi="Times New Roman" w:cs="Times New Roman"/>
+          <w:sz w:val="24"/>
+          <w:szCs w:val="24"/>
+          <w:lang w:val="sv-SE"/>
+        </w:rPr>
+        <w:t xml:space="preserve"> </w:t>
+      </w:r>
+      <w:r>
+        <w:rPr>
+          <w:rFonts w:ascii="Times New Roman" w:hAnsi="Times New Roman" w:cs="Times New Roman"/>
+          <w:sz w:val="24"/>
+          <w:szCs w:val="24"/>
+          <w:lang w:val="sv-SE"/>
+        </w:rPr>
+        <w:t>sebelumnya</w:t>
+      </w:r>
+    </w:p>
+    <w:p>
+      <w:pPr>
+        <w:rPr>
+          <w:rFonts w:ascii="Times New Roman" w:hAnsi="Times New Roman" w:cs="Times New Roman"/>
+          <w:sz w:val="24"/>
+          <w:szCs w:val="24"/>
+          <w:lang w:val="sv-SE"/>
+        </w:rPr>
+      </w:pPr>
+      <w:r>
+        <w:rPr>
+          <w:rFonts w:ascii="Times New Roman" w:hAnsi="Times New Roman" w:cs="Times New Roman"/>
+          <w:sz w:val="24"/>
+          <w:szCs w:val="24"/>
+          <w:lang w:val="sv-SE"/>
+        </w:rPr>
+        <w:t>F</w:t>
+      </w:r>
+      <w:r>
+        <w:rPr>
+          <w:rFonts w:ascii="Times New Roman" w:hAnsi="Times New Roman" w:cs="Times New Roman"/>
+          <w:sz w:val="24"/>
+          <w:szCs w:val="24"/>
+          <w:lang w:val="sv-SE"/>
+        </w:rPr>
+        <w:t>low</w:t>
+      </w:r>
+      <w:r>
+        <w:rPr>
+          <w:rFonts w:ascii="Times New Roman" w:hAnsi="Times New Roman" w:cs="Times New Roman"/>
+          <w:sz w:val="24"/>
+          <w:szCs w:val="24"/>
+          <w:lang w:val="sv-SE"/>
+        </w:rPr>
+        <w:t xml:space="preserve"> bot/web</w:t>
+      </w:r>
+    </w:p>
+    <w:p>
+      <w:pPr>
+        <w:pStyle w:val="ListParagraph"/>
+        <w:numPr>
+          <w:ilvl w:val="0"/>
+          <w:numId w:val="4"/>
+        </w:numPr>
+        <w:rPr>
+          <w:rFonts w:ascii="Times New Roman" w:hAnsi="Times New Roman" w:cs="Times New Roman"/>
+          <w:sz w:val="24"/>
+          <w:szCs w:val="24"/>
+          <w:lang w:val="sv-SE"/>
+        </w:rPr>
+      </w:pPr>
+      <w:r>
+        <w:rPr>
+          <w:rFonts w:ascii="Times New Roman" w:hAnsi="Times New Roman" w:cs="Times New Roman"/>
+          <w:sz w:val="24"/>
+          <w:szCs w:val="24"/>
+          <w:lang w:val="sv-SE"/>
+        </w:rPr>
+        <w:t>Dengan mcp docs google tadi, jadikan seluruh file word menjadi google docs y</w:t>
+      </w:r>
+      <w:r>
+        <w:rPr>
+          <w:rFonts w:ascii="Times New Roman" w:hAnsi="Times New Roman" w:cs="Times New Roman"/>
+          <w:sz w:val="24"/>
+          <w:szCs w:val="24"/>
+          <w:lang w:val="sv-SE"/>
+        </w:rPr>
+        <w:t>ang bisa di edit oleh bot</w:t>
+      </w:r>
+    </w:p>
+    <w:p>
+      <w:pPr>
+        <w:pStyle w:val="ListParagraph"/>
+        <w:numPr>
+          <w:ilvl w:val="0"/>
+          <w:numId w:val="4"/>
+        </w:numPr>
+        <w:rPr>
+          <w:rFonts w:ascii="Times New Roman" w:hAnsi="Times New Roman" w:cs="Times New Roman"/>
+          <w:sz w:val="24"/>
+          <w:szCs w:val="24"/>
+          <w:lang w:val="sv-SE"/>
+        </w:rPr>
+      </w:pPr>
+      <w:r>
+        <w:rPr>
+          <w:rFonts w:ascii="Times New Roman" w:hAnsi="Times New Roman" w:cs="Times New Roman"/>
+          <w:sz w:val="24"/>
+          <w:szCs w:val="24"/>
+          <w:lang w:val="sv-SE"/>
+        </w:rPr>
+        <w:t>Web menampilkan daftar file word yang sudah dit</w:t>
+      </w:r>
+      <w:r>
+        <w:rPr>
+          <w:rFonts w:ascii="Times New Roman" w:hAnsi="Times New Roman" w:cs="Times New Roman"/>
+          <w:sz w:val="24"/>
+          <w:szCs w:val="24"/>
+          <w:lang w:val="sv-SE"/>
+        </w:rPr>
+        <w:t xml:space="preserve">erima (dan tombol edit dimasing masing daftar), ketika user menekan tombol edit, maka </w:t>
+      </w:r>
+      <w:r>
+        <w:rPr>
+          <w:rFonts w:ascii="Times New Roman" w:hAnsi="Times New Roman" w:cs="Times New Roman"/>
+          <w:sz w:val="24"/>
+          <w:szCs w:val="24"/>
+          <w:lang w:val="sv-SE"/>
+        </w:rPr>
+        <w:t xml:space="preserve"> </w:t>
+      </w:r>
+    </w:p>
+    <w:p>
+      <w:pPr>
+        <w:pStyle w:val="ListParagraph"/>
+        <w:numPr>
+          <w:ilvl w:val="0"/>
+          <w:numId w:val="4"/>
+        </w:numPr>
+        <w:rPr>
+          <w:rFonts w:ascii="Times New Roman" w:hAnsi="Times New Roman" w:cs="Times New Roman"/>
+          <w:sz w:val="24"/>
+          <w:szCs w:val="24"/>
+          <w:lang w:val="sv-SE"/>
+        </w:rPr>
+      </w:pPr>
+      <w:r>
+        <w:rPr>
+          <w:rFonts w:ascii="Times New Roman" w:hAnsi="Times New Roman" w:cs="Times New Roman"/>
+          <w:sz w:val="24"/>
+          <w:szCs w:val="24"/>
+          <w:lang w:val="sv-SE"/>
+        </w:rPr>
+        <w:t xml:space="preserve">Web menampilkan Preview </w:t>
+      </w:r>
+      <w:r>
+        <w:rPr>
+          <w:rFonts w:ascii="Times New Roman" w:hAnsi="Times New Roman" w:cs="Times New Roman"/>
+          <w:sz w:val="24"/>
+          <w:szCs w:val="24"/>
+          <w:lang w:val="sv-SE"/>
+        </w:rPr>
+        <w:t>seluruh halaman file docs, yang sudah di ubah menyesuaikan template dan panduan didalam tab “</w:t>
+      </w:r>
+      <w:r>
+        <w:rPr>
+          <w:rFonts w:ascii="Times New Roman" w:hAnsi="Times New Roman" w:cs="Times New Roman"/>
+          <w:sz w:val="24"/>
+          <w:szCs w:val="24"/>
+          <w:lang w:val="sv-SE"/>
+        </w:rPr>
+        <w:t>Acuan Template Dokumen</w:t>
+      </w:r>
+      <w:r>
+        <w:rPr>
+          <w:rFonts w:ascii="Times New Roman" w:hAnsi="Times New Roman" w:cs="Times New Roman"/>
+          <w:sz w:val="24"/>
+          <w:szCs w:val="24"/>
+          <w:lang w:val="sv-SE"/>
+        </w:rPr>
+        <w:t>”</w:t>
+      </w:r>
+      <w:r>
+        <w:rPr>
+          <w:rFonts w:ascii="Times New Roman" w:hAnsi="Times New Roman" w:cs="Times New Roman"/>
+          <w:sz w:val="24"/>
+          <w:szCs w:val="24"/>
+          <w:lang w:val="sv-SE"/>
+        </w:rPr>
+        <w:t xml:space="preserve"> </w:t>
+      </w:r>
+      <w:r>
+        <w:rPr>
+          <w:rFonts w:ascii="Times New Roman" w:hAnsi="Times New Roman" w:cs="Times New Roman"/>
+          <w:sz w:val="24"/>
+          <w:szCs w:val="24"/>
+          <w:lang w:val="sv-SE"/>
+        </w:rPr>
+        <w:t>dengan mcp google docs</w:t>
+      </w:r>
+      <w:r>
+        <w:rPr>
+          <w:rFonts w:ascii="Times New Roman" w:hAnsi="Times New Roman" w:cs="Times New Roman"/>
+          <w:sz w:val="24"/>
+          <w:szCs w:val="24"/>
+          <w:lang w:val="sv-SE"/>
+        </w:rPr>
+        <w:t xml:space="preserve"> secara otomatis</w:t>
+      </w:r>
+    </w:p>
+    <w:p>
+      <w:pPr>
+        <w:pStyle w:val="ListParagraph"/>
+        <w:rPr>
+          <w:rFonts w:ascii="Times New Roman" w:hAnsi="Times New Roman" w:cs="Times New Roman"/>
+          <w:sz w:val="24"/>
+          <w:szCs w:val="24"/>
+          <w:lang w:val="sv-SE"/>
+        </w:rPr>
+      </w:pPr>
+      <w:r>
+        <w:rPr>
+          <w:rFonts w:ascii="Times New Roman" w:hAnsi="Times New Roman" w:cs="Times New Roman"/>
+          <w:sz w:val="24"/>
+          <w:szCs w:val="24"/>
+          <w:lang w:val="sv-SE"/>
+        </w:rPr>
+        <w:lastRenderedPageBreak/>
+        <w:drawing>
+          <wp:inline distT="0" distB="0" distL="0" distR="0" wp14:anchorId="6DDB7B10" wp14:editId="659EE51C">
+            <wp:extent cx="5943600" cy="3588385"/>
+            <wp:effectExtent l="0" t="0" r="0" b="0"/>
+            <wp:docPr id="1676571528" name="Picture 1"/>
+            <wp:cNvGraphicFramePr>
+              <a:graphicFrameLocks xmlns:a="http://schemas.openxmlformats.org/drawingml/2006/main" noChangeAspect="1"/>
+            </wp:cNvGraphicFramePr>
+            <a:graphic xmlns:a="http://schemas.openxmlformats.org/drawingml/2006/main">
+              <a:graphicData uri="http://schemas.openxmlformats.org/drawingml/2006/picture">
+                <pic:pic xmlns:pic="http://schemas.openxmlformats.org/drawingml/2006/picture">
+                  <pic:nvPicPr>
+                    <pic:cNvPr id="1676571528" name=""/>
                     <pic:cNvPicPr/>
                   </pic:nvPicPr>
                   <pic:blipFill>
-                    <a:blip r:embed="rId5"/>
+                    <a:blip r:embed="rId6"/>
                     <a:stretch>
                       <a:fillRect/>
                     </a:stretch>
@@ -1027,7 +1531,7 @@
                   <pic:spPr>
                     <a:xfrm>
                       <a:off x="0" y="0"/>
-                      <a:ext cx="3009565" cy="2124381"/>
+                      <a:ext cx="5943600" cy="3588385"/>
                     </a:xfrm>
                     <a:prstGeom prst="rect">
                       <a:avLst/>
@@ -1043,6 +1547,88 @@
     <w:p>
       <w:pPr>
         <w:pStyle w:val="ListParagraph"/>
+        <w:numPr>
+          <w:ilvl w:val="0"/>
+          <w:numId w:val="4"/>
+        </w:numPr>
+        <w:rPr>
+          <w:rFonts w:ascii="Times New Roman" w:hAnsi="Times New Roman" w:cs="Times New Roman"/>
+          <w:sz w:val="24"/>
+          <w:szCs w:val="24"/>
+          <w:lang w:val="sv-SE"/>
+        </w:rPr>
+      </w:pPr>
+      <w:r>
+        <w:rPr>
+          <w:rFonts w:ascii="Times New Roman" w:hAnsi="Times New Roman" w:cs="Times New Roman"/>
+          <w:sz w:val="24"/>
+          <w:szCs w:val="24"/>
+          <w:lang w:val="sv-SE"/>
+        </w:rPr>
+        <w:t>Letahan bagian preview dibawah tab “</w:t>
+      </w:r>
+      <w:r>
+        <w:rPr>
+          <w:rFonts w:ascii="Times New Roman" w:hAnsi="Times New Roman" w:cs="Times New Roman"/>
+          <w:b/>
+          <w:bCs/>
+          <w:sz w:val="24"/>
+          <w:szCs w:val="24"/>
+          <w:lang w:val="sv-SE"/>
+        </w:rPr>
+        <w:t>Penomoran Kode Dokumen &amp; Klasifikasi NBE</w:t>
+      </w:r>
+      <w:r>
+        <w:rPr>
+          <w:rFonts w:ascii="Times New Roman" w:hAnsi="Times New Roman" w:cs="Times New Roman"/>
+          <w:b/>
+          <w:bCs/>
+          <w:sz w:val="24"/>
+          <w:szCs w:val="24"/>
+          <w:lang w:val="sv-SE"/>
+        </w:rPr>
+        <w:t xml:space="preserve">” </w:t>
+      </w:r>
+      <w:r>
+        <w:rPr>
+          <w:rFonts w:ascii="Times New Roman" w:hAnsi="Times New Roman" w:cs="Times New Roman"/>
+          <w:sz w:val="24"/>
+          <w:szCs w:val="24"/>
+          <w:lang w:val="sv-SE"/>
+        </w:rPr>
+        <w:t xml:space="preserve">jangan disamping seperti itu, gak enak liatnya, preview itu juga harus bisa menampilkan </w:t>
+      </w:r>
+      <w:r>
+        <w:rPr>
+          <w:rFonts w:ascii="Times New Roman" w:hAnsi="Times New Roman" w:cs="Times New Roman"/>
+          <w:sz w:val="24"/>
+          <w:szCs w:val="24"/>
+          <w:lang w:val="sv-SE"/>
+        </w:rPr>
+        <w:t xml:space="preserve">kondisi nyata sesuai ukuran kertas yang ada di </w:t>
+      </w:r>
+      <w:r>
+        <w:rPr>
+          <w:rFonts w:ascii="Times New Roman" w:hAnsi="Times New Roman" w:cs="Times New Roman"/>
+          <w:sz w:val="24"/>
+          <w:szCs w:val="24"/>
+          <w:lang w:val="sv-SE"/>
+        </w:rPr>
+        <w:t>tab “</w:t>
+      </w:r>
+      <w:r>
+        <w:rPr>
+          <w:rFonts w:ascii="Times New Roman" w:hAnsi="Times New Roman" w:cs="Times New Roman"/>
+          <w:sz w:val="24"/>
+          <w:szCs w:val="24"/>
+          <w:lang w:val="sv-SE"/>
+        </w:rPr>
+        <w:t>Acuan Template Dokumen”</w:t>
+      </w:r>
+    </w:p>
+    <w:p>
+      <w:pPr>
+        <w:ind w:left="360"/>
         <w:rPr>
           <w:rFonts w:ascii="Times New Roman" w:hAnsi="Times New Roman" w:cs="Times New Roman"/>
           <w:sz w:val="24"/>
@@ -1077,6 +1663,7 @@
       <w:r>
         <w:rPr>
           <w:rFonts w:ascii="Times New Roman" w:hAnsi="Times New Roman" w:cs="Times New Roman"/>
+          <w:noProof/>
           <w:sz w:val="24"/>
           <w:szCs w:val="24"/>
           <w:lang w:val="sv-SE"/>
@@ -1097,7 +1684,7 @@
                     <pic:cNvPicPr/>
                   </pic:nvPicPr>
                   <pic:blipFill>
-                    <a:blip r:embed="rId6"/>
+                    <a:blip r:embed="rId7"/>
                     <a:stretch>
                       <a:fillRect/>
                     </a:stretch>
@@ -1302,7 +1889,17 @@
           <w:szCs w:val="24"/>
           <w:lang w:val="sv-SE"/>
         </w:rPr>
-        <w:t xml:space="preserve">Initial Edition – </w:t>
+        <w:t xml:space="preserve">Initial </w:t>
+      </w:r>
+      <w:r>
+        <w:rPr>
+          <w:rFonts w:ascii="Times New Roman" w:hAnsi="Times New Roman" w:cs="Times New Roman"/>
+          <w:sz w:val="24"/>
+          <w:szCs w:val="24"/>
+          <w:lang w:val="sv-SE"/>
+        </w:rPr>
+        <w:lastRenderedPageBreak/>
+        <w:t xml:space="preserve">Edition – </w:t>
       </w:r>
       <w:r>
         <w:rPr>
@@ -1380,16 +1977,7 @@
           <w:szCs w:val="24"/>
           <w:lang w:val="sv-SE"/>
         </w:rPr>
-        <w:t xml:space="preserve">, dan tabel Reveision index </w:t>
-      </w:r>
-      <w:r>
-        <w:rPr>
-          <w:rFonts w:ascii="Times New Roman" w:hAnsi="Times New Roman" w:cs="Times New Roman"/>
-          <w:sz w:val="24"/>
-          <w:szCs w:val="24"/>
-          <w:lang w:val="sv-SE"/>
-        </w:rPr>
-        <w:t>otomatis berubah mengikuti perubaha yang ada di tab tersebut.</w:t>
+        <w:t>, dan tabel Reveision index otomatis berubah mengikuti perubaha yang ada di tab tersebut.</w:t>
       </w:r>
     </w:p>
     <w:p>
@@ -1857,7 +2445,6 @@
           <w:szCs w:val="24"/>
           <w:lang w:val="nb-NO"/>
         </w:rPr>
-        <w:lastRenderedPageBreak/>
         <w:t>User akan diberi pilihan untuk mene</w:t>
       </w:r>
       <w:r>
@@ -2184,7 +2771,7 @@
   <w:abstractNum w:abstractNumId="1" w15:restartNumberingAfterBreak="0">
     <w:nsid w:val="2FBD1517"/>
     <w:multiLevelType w:val="hybridMultilevel"/>
-    <w:tmpl w:val="6CDA7BFE"/>
+    <w:tmpl w:val="9432D0FE"/>
     <w:lvl w:ilvl="0" w:tplc="FFFFFFFF">
       <w:start w:val="1"/>
       <w:numFmt w:val="decimal"/>
@@ -2726,6 +3313,95 @@
       <w:lvlJc w:val="left"/>
       <w:pPr>
         <w:ind w:left="1080" w:hanging="360"/>
+      </w:pPr>
+      <w:rPr>
+        <w:rFonts w:hint="default"/>
+      </w:rPr>
+    </w:lvl>
+    <w:lvl w:ilvl="1" w:tplc="04090019" w:tentative="1">
+      <w:start w:val="1"/>
+      <w:numFmt w:val="lowerLetter"/>
+      <w:lvlText w:val="%2."/>
+      <w:lvlJc w:val="left"/>
+      <w:pPr>
+        <w:ind w:left="1440" w:hanging="360"/>
+      </w:pPr>
+    </w:lvl>
+    <w:lvl w:ilvl="2" w:tplc="0409001B" w:tentative="1">
+      <w:start w:val="1"/>
+      <w:numFmt w:val="lowerRoman"/>
+      <w:lvlText w:val="%3."/>
+      <w:lvlJc w:val="right"/>
+      <w:pPr>
+        <w:ind w:left="2160" w:hanging="180"/>
+      </w:pPr>
+    </w:lvl>
+    <w:lvl w:ilvl="3" w:tplc="0409000F" w:tentative="1">
+      <w:start w:val="1"/>
+      <w:numFmt w:val="decimal"/>
+      <w:lvlText w:val="%4."/>
+      <w:lvlJc w:val="left"/>
+      <w:pPr>
+        <w:ind w:left="2880" w:hanging="360"/>
+      </w:pPr>
+    </w:lvl>
+    <w:lvl w:ilvl="4" w:tplc="04090019" w:tentative="1">
+      <w:start w:val="1"/>
+      <w:numFmt w:val="lowerLetter"/>
+      <w:lvlText w:val="%5."/>
+      <w:lvlJc w:val="left"/>
+      <w:pPr>
+        <w:ind w:left="3600" w:hanging="360"/>
+      </w:pPr>
+    </w:lvl>
+    <w:lvl w:ilvl="5" w:tplc="0409001B" w:tentative="1">
+      <w:start w:val="1"/>
+      <w:numFmt w:val="lowerRoman"/>
+      <w:lvlText w:val="%6."/>
+      <w:lvlJc w:val="right"/>
+      <w:pPr>
+        <w:ind w:left="4320" w:hanging="180"/>
+      </w:pPr>
+    </w:lvl>
+    <w:lvl w:ilvl="6" w:tplc="0409000F" w:tentative="1">
+      <w:start w:val="1"/>
+      <w:numFmt w:val="decimal"/>
+      <w:lvlText w:val="%7."/>
+      <w:lvlJc w:val="left"/>
+      <w:pPr>
+        <w:ind w:left="5040" w:hanging="360"/>
+      </w:pPr>
+    </w:lvl>
+    <w:lvl w:ilvl="7" w:tplc="04090019" w:tentative="1">
+      <w:start w:val="1"/>
+      <w:numFmt w:val="lowerLetter"/>
+      <w:lvlText w:val="%8."/>
+      <w:lvlJc w:val="left"/>
+      <w:pPr>
+        <w:ind w:left="5760" w:hanging="360"/>
+      </w:pPr>
+    </w:lvl>
+    <w:lvl w:ilvl="8" w:tplc="0409001B" w:tentative="1">
+      <w:start w:val="1"/>
+      <w:numFmt w:val="lowerRoman"/>
+      <w:lvlText w:val="%9."/>
+      <w:lvlJc w:val="right"/>
+      <w:pPr>
+        <w:ind w:left="6480" w:hanging="180"/>
+      </w:pPr>
+    </w:lvl>
+  </w:abstractNum>
+  <w:abstractNum w:abstractNumId="8" w15:restartNumberingAfterBreak="0">
+    <w:nsid w:val="6FAD0532"/>
+    <w:multiLevelType w:val="hybridMultilevel"/>
+    <w:tmpl w:val="0950AF76"/>
+    <w:lvl w:ilvl="0" w:tplc="FFFFFFFF">
+      <w:start w:val="1"/>
+      <w:numFmt w:val="decimal"/>
+      <w:lvlText w:val="%1."/>
+      <w:lvlJc w:val="left"/>
+      <w:pPr>
+        <w:ind w:left="720" w:hanging="360"/>
       </w:pPr>
       <w:rPr>
         <w:rFonts w:hint="default"/>
@@ -2827,6 +3503,9 @@
   </w:num>
   <w:num w:numId="8" w16cid:durableId="784228657">
     <w:abstractNumId w:val="7"/>
+  </w:num>
+  <w:num w:numId="9" w16cid:durableId="672682785">
+    <w:abstractNumId w:val="8"/>
   </w:num>
 </w:numbering>
 </file>
@@ -3306,7 +3985,6 @@
     <w:next w:val="Normal"/>
     <w:link w:val="Heading4Char"/>
     <w:uiPriority w:val="9"/>
-    <w:semiHidden/>
     <w:unhideWhenUsed/>
     <w:qFormat/>
     <w:rsid w:val="008D4507"/>
@@ -3503,7 +4181,6 @@
     <w:basedOn w:val="DefaultParagraphFont"/>
     <w:link w:val="Heading4"/>
     <w:uiPriority w:val="9"/>
-    <w:semiHidden/>
     <w:rsid w:val="008D4507"/>
     <w:rPr>
       <w:rFonts w:asciiTheme="minorHAnsi" w:eastAsiaTheme="majorEastAsia" w:hAnsiTheme="minorHAnsi" w:cstheme="majorBidi"/>

</xml_diff>